<commit_message>
Add sample SOPs and update PRD sourcing strategy
</commit_message>
<xml_diff>
--- a/docs/WorkProof_PRD.docx
+++ b/docs/WorkProof_PRD.docx
@@ -2150,6 +2150,259 @@
       </w:pPr>
       <w:r>
         <w:t xml:space="preserve">• 해외 시장 대응: OSHA language/vocabulary compliance positioning</w:t>
+      </w:r>
+    </w:p>
+    <w:p/>
+    <w:p/>
+    <w:p>
+      <w:pPr>
+        <w:pStyle w:val="Heading1"/>
+      </w:pPr>
+      <w:r>
+        <w:rPr>
+          <w:b/>
+        </w:rPr>
+        <w:t xml:space="preserve">16. SOP 자료 확보 전략 및 샘플 SOP 세트</w:t>
+      </w:r>
+    </w:p>
+    <w:p>
+      <w:pPr>
+        <w:pStyle w:val="Heading2"/>
+      </w:pPr>
+      <w:r>
+        <w:rPr>
+          <w:b/>
+        </w:rPr>
+        <w:t xml:space="preserve">16.1 실제 현장 SOP 확보 가능성</w:t>
+      </w:r>
+    </w:p>
+    <w:p>
+      <w:pPr>
+        <w:pStyle w:val="BodyText"/>
+      </w:pPr>
+      <w:r>
+        <w:t xml:space="preserve">실제 회사 내부 SOP 원본은 보통 영업비밀, 설비 정보, 안전관리 체계가 포함되어 있어 공개적으로 구하기 어렵다. 따라서 해커톤/MVP 단계에서는 공개 안전자료와 표준작업절차서 양식을 기반으로 “SOP-like” 샘플을 만들고, 이후 파일럿 인터뷰에서 익명화된 실제 문서 일부를 확보하는 방식이 현실적이다.</w:t>
+      </w:r>
+    </w:p>
+    <w:p/>
+    <w:p>
+      <w:pPr>
+        <w:pStyle w:val="Heading2"/>
+      </w:pPr>
+      <w:r>
+        <w:rPr>
+          <w:b/>
+        </w:rPr>
+        <w:t xml:space="preserve">16.2 MVP 단계에서 사용할 수 있는 자료 유형</w:t>
+      </w:r>
+    </w:p>
+    <w:p>
+      <w:pPr>
+        <w:pStyle w:val="BodyText"/>
+      </w:pPr>
+      <w:r>
+        <w:t xml:space="preserve">• 고용노동부/안전보건공단의 외국인 근로자용 안전보건 교육자료</w:t>
+      </w:r>
+    </w:p>
+    <w:p>
+      <w:pPr>
+        <w:pStyle w:val="BodyText"/>
+      </w:pPr>
+      <w:r>
+        <w:t xml:space="preserve">• KOSHA 자료 아카이브의 작업별 안전수칙, OPS, 안전작업 안내문</w:t>
+      </w:r>
+    </w:p>
+    <w:p>
+      <w:pPr>
+        <w:pStyle w:val="BodyText"/>
+      </w:pPr>
+      <w:r>
+        <w:t xml:space="preserve">• 지게차, 컨베이어, 프레스, 용접, 밀폐공간 등 산재 다발 작업 자료</w:t>
+      </w:r>
+    </w:p>
+    <w:p>
+      <w:pPr>
+        <w:pStyle w:val="BodyText"/>
+      </w:pPr>
+      <w:r>
+        <w:t xml:space="preserve">• 제조업 작업표준서/안전작업절차서 공개 양식</w:t>
+      </w:r>
+    </w:p>
+    <w:p>
+      <w:pPr>
+        <w:pStyle w:val="BodyText"/>
+      </w:pPr>
+      <w:r>
+        <w:t xml:space="preserve">• 회사명/제품명/수치가 제거된 익명화 실제 작업지시서 일부</w:t>
+      </w:r>
+    </w:p>
+    <w:p/>
+    <w:p>
+      <w:pPr>
+        <w:pStyle w:val="Heading2"/>
+      </w:pPr>
+      <w:r>
+        <w:rPr>
+          <w:b/>
+        </w:rPr>
+        <w:t xml:space="preserve">16.3 WorkProof repo에 추가한 샘플 SOP</w:t>
+      </w:r>
+    </w:p>
+    <w:p>
+      <w:pPr>
+        <w:pStyle w:val="BodyText"/>
+      </w:pPr>
+      <w:r>
+        <w:t xml:space="preserve">다음 샘플 SOP는 특정 회사의 실제 내부 문서가 아니라, 공공 안전자료와 일반적인 현장 안전수칙을 바탕으로 MVP 데모용으로 재구성한 문서다. 실제 현장 적용 전에는 반드시 사업장 안전관리자/관리감독자의 검토가 필요하다.</w:t>
+      </w:r>
+    </w:p>
+    <w:p/>
+    <w:p>
+      <w:pPr>
+        <w:pStyle w:val="BodyText"/>
+      </w:pPr>
+      <w:r>
+        <w:t xml:space="preserve">• `docs/sample-sops/forklift_precheck_ko.md` — 지게차 작업 전 점검 및 이동 작업</w:t>
+      </w:r>
+    </w:p>
+    <w:p>
+      <w:pPr>
+        <w:pStyle w:val="BodyText"/>
+      </w:pPr>
+      <w:r>
+        <w:t xml:space="preserve">• `docs/sample-sops/press_cleaning_lockout_ko.md` — 프레스 설비 청소/점검 전 전원차단</w:t>
+      </w:r>
+    </w:p>
+    <w:p>
+      <w:pPr>
+        <w:pStyle w:val="BodyText"/>
+      </w:pPr>
+      <w:r>
+        <w:t xml:space="preserve">• `docs/sample-sops/welding_fire_prevention_ko.md` — 용접·용단 화재 예방 작업</w:t>
+      </w:r>
+    </w:p>
+    <w:p>
+      <w:pPr>
+        <w:pStyle w:val="BodyText"/>
+      </w:pPr>
+      <w:r>
+        <w:t xml:space="preserve">• `docs/sample-sops/confined_space_entry_ko.md` — 밀폐공간 출입 전 안전 확인</w:t>
+      </w:r>
+    </w:p>
+    <w:p>
+      <w:pPr>
+        <w:pStyle w:val="BodyText"/>
+      </w:pPr>
+      <w:r>
+        <w:t xml:space="preserve">• `docs/sample-sops/conveyor_jam_clear_ko.md` — 컨베이어 끼임/걸림 해소 작업</w:t>
+      </w:r>
+    </w:p>
+    <w:p/>
+    <w:p>
+      <w:pPr>
+        <w:pStyle w:val="Heading2"/>
+      </w:pPr>
+      <w:r>
+        <w:rPr>
+          <w:b/>
+        </w:rPr>
+        <w:t xml:space="preserve">16.4 실제 SOP 확보 요청 문구</w:t>
+      </w:r>
+    </w:p>
+    <w:p>
+      <w:pPr>
+        <w:pStyle w:val="BodyText"/>
+      </w:pPr>
+      <w:r>
+        <w:t xml:space="preserve">“실제 공정명이나 회사명은 전부 가려도 됩니다. 외국인 근로자 교육용으로 작업지시서를 다국어 카드와 이해도 퀴즈로 바꾸는 MVP를 만들고 있어서, 지게차/프레스/용접/세척 같은 단순 작업 SOP 샘플 1개만 테스트해보고 싶습니다.”</w:t>
+      </w:r>
+    </w:p>
+    <w:p/>
+    <w:p>
+      <w:pPr>
+        <w:pStyle w:val="Heading2"/>
+      </w:pPr>
+      <w:r>
+        <w:rPr>
+          <w:b/>
+        </w:rPr>
+        <w:t xml:space="preserve">16.5 샘플 SOP 활용 방법</w:t>
+      </w:r>
+    </w:p>
+    <w:p>
+      <w:pPr>
+        <w:pStyle w:val="BodyText"/>
+      </w:pPr>
+      <w:r>
+        <w:t xml:space="preserve">1. 샘플 SOP 1개를 WorkProof에 업로드한다.</w:t>
+      </w:r>
+    </w:p>
+    <w:p>
+      <w:pPr>
+        <w:pStyle w:val="BodyText"/>
+      </w:pPr>
+      <w:r>
+        <w:t xml:space="preserve">2. AI가 작업 단계, 위험요소, 보호구, 금지행동을 추출한다.</w:t>
+      </w:r>
+    </w:p>
+    <w:p>
+      <w:pPr>
+        <w:pStyle w:val="BodyText"/>
+      </w:pPr>
+      <w:r>
+        <w:t xml:space="preserve">3. 베트남어/네팔어/캄보디아어 등으로 교육 카드를 생성한다.</w:t>
+      </w:r>
+    </w:p>
+    <w:p>
+      <w:pPr>
+        <w:pStyle w:val="BodyText"/>
+      </w:pPr>
+      <w:r>
+        <w:t xml:space="preserve">4. 작업자가 QR로 접속해 교육을 완료한다.</w:t>
+      </w:r>
+    </w:p>
+    <w:p>
+      <w:pPr>
+        <w:pStyle w:val="BodyText"/>
+      </w:pPr>
+      <w:r>
+        <w:t xml:space="preserve">5. 관리자 대시보드에서 완료 시간, 언어, 퀴즈 점수, 서명 로그를 확인한다.</w:t>
+      </w:r>
+    </w:p>
+    <w:p/>
+    <w:p>
+      <w:pPr>
+        <w:pStyle w:val="Heading2"/>
+      </w:pPr>
+      <w:r>
+        <w:rPr>
+          <w:b/>
+        </w:rPr>
+        <w:t xml:space="preserve">16.6 샘플 SOP 관련 리스크</w:t>
+      </w:r>
+    </w:p>
+    <w:p>
+      <w:pPr>
+        <w:pStyle w:val="BodyText"/>
+      </w:pPr>
+      <w:r>
+        <w:t xml:space="preserve">• 샘플 SOP는 법적 안전교육 또는 공식 작업허가서를 대체하지 않는다.</w:t>
+      </w:r>
+    </w:p>
+    <w:p>
+      <w:pPr>
+        <w:pStyle w:val="BodyText"/>
+      </w:pPr>
+      <w:r>
+        <w:t xml:space="preserve">• 공공자료 기반으로 재구성한 문서이므로 현장별 설비, 공정, 위험성평가 결과를 반영해야 한다.</w:t>
+      </w:r>
+    </w:p>
+    <w:p>
+      <w:pPr>
+        <w:pStyle w:val="BodyText"/>
+      </w:pPr>
+      <w:r>
+        <w:t xml:space="preserve">• 투자자/심사위원 데모에서는 “실제 내부 SOP”가 아니라 “공개자료 기반 데모용 SOP”임을 명확히 표시한다.</w:t>
       </w:r>
     </w:p>
     <w:p/>

</xml_diff>